<commit_message>
Small Documentation Update and Fixes
</commit_message>
<xml_diff>
--- a/Deliverables/4.Deliverables-Dependability/Software Dependability Report.docx
+++ b/Deliverables/4.Deliverables-Dependability/Software Dependability Report.docx
@@ -1,6 +1,6 @@
 
 <file path=word/document.xml><?xml version="1.0" encoding="utf-8"?>
-<w:document xmlns:wpc="http://schemas.microsoft.com/office/word/2010/wordprocessingCanvas" xmlns:cx="http://schemas.microsoft.com/office/drawing/2014/chartex" xmlns:cx1="http://schemas.microsoft.com/office/drawing/2015/9/8/chartex" xmlns:cx2="http://schemas.microsoft.com/office/drawing/2015/10/21/chartex" xmlns:cx3="http://schemas.microsoft.com/office/drawing/2016/5/9/chartex" xmlns:cx4="http://schemas.microsoft.com/office/drawing/2016/5/10/chartex" xmlns:cx5="http://schemas.microsoft.com/office/drawing/2016/5/11/chartex" xmlns:cx6="http://schemas.microsoft.com/office/drawing/2016/5/12/chartex" xmlns:cx7="http://schemas.microsoft.com/office/drawing/2016/5/13/chartex" xmlns:cx8="http://schemas.microsoft.com/office/drawing/2016/5/14/chartex" xmlns:mc="http://schemas.openxmlformats.org/markup-compatibility/2006" xmlns:aink="http://schemas.microsoft.com/office/drawing/2016/ink" xmlns:am3d="http://schemas.microsoft.com/office/drawing/2017/model3d" xmlns:o="urn:schemas-microsoft-com:office:office" xmlns:oel="http://schemas.microsoft.com/office/2019/extlst" xmlns:r="http://schemas.openxmlformats.org/officeDocument/2006/relationships" xmlns:m="http://schemas.openxmlformats.org/officeDocument/2006/math" xmlns:v="urn:schemas-microsoft-com:vml" xmlns:wp14="http://schemas.microsoft.com/office/word/2010/wordprocessingDrawing" xmlns:wp="http://schemas.openxmlformats.org/drawingml/2006/wordprocessingDrawing" xmlns:w10="urn:schemas-microsoft-com:office:word" xmlns:w="http://schemas.openxmlformats.org/wordprocessingml/2006/main" xmlns:w14="http://schemas.microsoft.com/office/word/2010/wordml" xmlns:w15="http://schemas.microsoft.com/office/word/2012/wordml" xmlns:w16cex="http://schemas.microsoft.com/office/word/2018/wordml/cex" xmlns:w16cid="http://schemas.microsoft.com/office/word/2016/wordml/cid" xmlns:w16="http://schemas.microsoft.com/office/word/2018/wordml" xmlns:w16du="http://schemas.microsoft.com/office/word/2023/wordml/word16du" xmlns:w16sdtdh="http://schemas.microsoft.com/office/word/2020/wordml/sdtdatahash" xmlns:w16sdtfl="http://schemas.microsoft.com/office/word/2024/wordml/sdtformatlock" xmlns:w16se="http://schemas.microsoft.com/office/word/2015/wordml/symex" xmlns:wpg="http://schemas.microsoft.com/office/word/2010/wordprocessingGroup" xmlns:wpi="http://schemas.microsoft.com/office/word/2010/wordprocessingInk" xmlns:wne="http://schemas.microsoft.com/office/word/2006/wordml" xmlns:wps="http://schemas.microsoft.com/office/word/2010/wordprocessingShape" mc:Ignorable="w14 w15 w16se w16cid w16 w16cex w16sdtdh w16sdtfl w16du wp14">
+<w:document xmlns:wpc="http://schemas.microsoft.com/office/word/2010/wordprocessingCanvas" xmlns:cx="http://schemas.microsoft.com/office/drawing/2014/chartex" xmlns:cx1="http://schemas.microsoft.com/office/drawing/2015/9/8/chartex" xmlns:cx2="http://schemas.microsoft.com/office/drawing/2015/10/21/chartex" xmlns:cx3="http://schemas.microsoft.com/office/drawing/2016/5/9/chartex" xmlns:cx4="http://schemas.microsoft.com/office/drawing/2016/5/10/chartex" xmlns:cx5="http://schemas.microsoft.com/office/drawing/2016/5/11/chartex" xmlns:cx6="http://schemas.microsoft.com/office/drawing/2016/5/12/chartex" xmlns:cx7="http://schemas.microsoft.com/office/drawing/2016/5/13/chartex" xmlns:cx8="http://schemas.microsoft.com/office/drawing/2016/5/14/chartex" xmlns:mc="http://schemas.openxmlformats.org/markup-compatibility/2006" xmlns:aink="http://schemas.microsoft.com/office/drawing/2016/ink" xmlns:am3d="http://schemas.microsoft.com/office/drawing/2017/model3d" xmlns:o="urn:schemas-microsoft-com:office:office" xmlns:oel="http://schemas.microsoft.com/office/2019/extlst" xmlns:r="http://schemas.openxmlformats.org/officeDocument/2006/relationships" xmlns:m="http://schemas.openxmlformats.org/officeDocument/2006/math" xmlns:v="urn:schemas-microsoft-com:vml" xmlns:wp14="http://schemas.microsoft.com/office/word/2010/wordprocessingDrawing" xmlns:wp="http://schemas.openxmlformats.org/drawingml/2006/wordprocessingDrawing" xmlns:w10="urn:schemas-microsoft-com:office:word" xmlns:w="http://schemas.openxmlformats.org/wordprocessingml/2006/main" xmlns:w14="http://schemas.microsoft.com/office/word/2010/wordml" xmlns:w15="http://schemas.microsoft.com/office/word/2012/wordml" xmlns:w16cei="http://schemas.microsoft.com/office/word/2026/wordml/cei" xmlns:w16cex="http://schemas.microsoft.com/office/word/2018/wordml/cex" xmlns:w16cid="http://schemas.microsoft.com/office/word/2016/wordml/cid" xmlns:w16="http://schemas.microsoft.com/office/word/2018/wordml" xmlns:w16du="http://schemas.microsoft.com/office/word/2023/wordml/word16du" xmlns:w16sdtdh="http://schemas.microsoft.com/office/word/2020/wordml/sdtdatahash" xmlns:w16sdtfl="http://schemas.microsoft.com/office/word/2024/wordml/sdtformatlock" xmlns:w16se="http://schemas.microsoft.com/office/word/2015/wordml/symex" xmlns:wpg="http://schemas.microsoft.com/office/word/2010/wordprocessingGroup" xmlns:wpi="http://schemas.microsoft.com/office/word/2010/wordprocessingInk" xmlns:wne="http://schemas.microsoft.com/office/word/2006/wordml" xmlns:wps="http://schemas.microsoft.com/office/word/2010/wordprocessingShape" mc:Ignorable="w14 w15 w16se w16cid w16 w16cex w16sdtdh w16sdtfl w16du wp14">
   <w:body>
     <w:tbl>
       <w:tblPr>
@@ -396,7 +396,7 @@
           <w:szCs w:val="32"/>
           <w:lang w:val="it-IT"/>
         </w:rPr>
-        <w:t>15</w:t>
+        <w:t>31</w:t>
       </w:r>
       <w:r>
         <w:rPr>
@@ -439,6 +439,7 @@
         <w:rPr>
           <w:sz w:val="30"/>
           <w:szCs w:val="30"/>
+          <w:lang w:val="it-IT"/>
         </w:rPr>
       </w:pPr>
       <w:r>
@@ -450,6 +451,26 @@
           <w:lang w:val="it-IT"/>
         </w:rPr>
         <w:t>Bruno Nesticò, Francesco Rao</w:t>
+      </w:r>
+      <w:r>
+        <w:rPr>
+          <w:i/>
+          <w:iCs/>
+          <w:sz w:val="30"/>
+          <w:szCs w:val="30"/>
+          <w:lang w:val="it-IT"/>
+        </w:rPr>
+        <w:t>,</w:t>
+      </w:r>
+      <w:r>
+        <w:rPr>
+          <w:i/>
+          <w:iCs/>
+          <w:sz w:val="30"/>
+          <w:szCs w:val="30"/>
+          <w:lang w:val="it-IT"/>
+        </w:rPr>
+        <w:t xml:space="preserve"> Roberto Fiorenza</w:t>
       </w:r>
     </w:p>
     <w:p>
@@ -3215,15 +3236,11 @@
     </w:p>
     <w:p>
       <w:pPr>
-        <w:jc w:val="both"/>
-      </w:pPr>
-    </w:p>
-    <w:p>
-      <w:pPr>
         <w:pStyle w:val="Heading2"/>
         <w:jc w:val="both"/>
       </w:pPr>
       <w:r>
+        <w:lastRenderedPageBreak/>
         <w:t>4.2 Service Definition in Docker Compose</w:t>
       </w:r>
     </w:p>
@@ -3670,7 +3687,7 @@
           <w:noProof/>
         </w:rPr>
         <w:drawing>
-          <wp:inline distT="0" distB="0" distL="0" distR="0" wp14:anchorId="3337AC8F" wp14:editId="5103AA11">
+          <wp:inline distT="0" distB="0" distL="0" distR="0" wp14:anchorId="3337AC8F" wp14:editId="44A0622A">
             <wp:extent cx="5731510" cy="1496695"/>
             <wp:effectExtent l="0" t="0" r="2540" b="8255"/>
             <wp:docPr id="1764701060" name="Picture 2"/>
@@ -4075,7 +4092,7 @@
           <w:noProof/>
         </w:rPr>
         <w:drawing>
-          <wp:inline distT="0" distB="0" distL="0" distR="0" wp14:anchorId="77B13708" wp14:editId="5EE6A2E2">
+          <wp:inline distT="0" distB="0" distL="0" distR="0" wp14:anchorId="77B13708" wp14:editId="30D3B3AB">
             <wp:extent cx="5731510" cy="2716530"/>
             <wp:effectExtent l="0" t="0" r="2540" b="7620"/>
             <wp:docPr id="1737565043" name="Picture 4"/>
@@ -4876,6 +4893,12 @@
         </w:rPr>
         <w:t xml:space="preserve"> rules.</w:t>
       </w:r>
+      <w:r>
+        <w:rPr>
+          <w:lang w:val="en-US"/>
+        </w:rPr>
+        <w:br/>
+      </w:r>
     </w:p>
     <w:p>
       <w:pPr>
@@ -5144,6 +5167,9 @@
           <w:t>https://github.com/superfra01/Rated-Dependability/tree/main/Deliverables/4.Deliverables-Dependability/Analisi/JMH/after</w:t>
         </w:r>
       </w:hyperlink>
+      <w:r>
+        <w:br/>
+      </w:r>
     </w:p>
     <w:p>
       <w:pPr>
@@ -5186,6 +5212,9 @@
       <w:r>
         <w:t xml:space="preserve"> goal is not merely "style cleanup," but rather to detect patterns that introduce resource waste, thereby increasing execution time and system load.</w:t>
       </w:r>
+      <w:r>
+        <w:br/>
+      </w:r>
     </w:p>
     <w:p>
       <w:pPr>
@@ -5195,11 +5224,10 @@
         <w:rPr>
           <w:noProof/>
         </w:rPr>
-        <w:lastRenderedPageBreak/>
         <w:drawing>
-          <wp:inline distT="0" distB="0" distL="0" distR="0" wp14:anchorId="26B50056" wp14:editId="691016EF">
-            <wp:extent cx="3634740" cy="3238500"/>
-            <wp:effectExtent l="0" t="0" r="3810" b="0"/>
+          <wp:inline distT="0" distB="0" distL="0" distR="0" wp14:anchorId="26B50056" wp14:editId="545FC0B8">
+            <wp:extent cx="2255520" cy="2009635"/>
+            <wp:effectExtent l="0" t="0" r="0" b="0"/>
             <wp:docPr id="347308343" name="Picture 6"/>
             <wp:cNvGraphicFramePr>
               <a:graphicFrameLocks xmlns:a="http://schemas.openxmlformats.org/drawingml/2006/main" noChangeAspect="1"/>
@@ -5229,7 +5257,7 @@
                   <pic:spPr bwMode="auto">
                     <a:xfrm>
                       <a:off x="0" y="0"/>
-                      <a:ext cx="3634740" cy="3238500"/>
+                      <a:ext cx="2297704" cy="2047220"/>
                     </a:xfrm>
                     <a:prstGeom prst="rect">
                       <a:avLst/>
@@ -5280,17 +5308,9 @@
     <w:p>
       <w:pPr>
         <w:jc w:val="both"/>
-        <w:rPr>
-          <w:b/>
-          <w:bCs/>
-        </w:rPr>
-      </w:pPr>
-    </w:p>
-    <w:p>
-      <w:pPr>
-        <w:jc w:val="both"/>
-      </w:pPr>
-      <w:r>
+      </w:pPr>
+      <w:r>
+        <w:lastRenderedPageBreak/>
         <w:t xml:space="preserve">The initial static analysis identified six distinct categories of issues, </w:t>
       </w:r>
       <w:proofErr w:type="spellStart"/>
@@ -5407,11 +5427,7 @@
       </w:r>
       <w:proofErr w:type="spellEnd"/>
       <w:r>
-        <w:t xml:space="preserve">++, avoiding the evaluation of collection size within loop conditions, and avoiding function calls </w:t>
-      </w:r>
-      <w:r>
-        <w:lastRenderedPageBreak/>
-        <w:t>inside for loop declarations. These anti-patterns waste redundant CPU cycles and energy during repeated executions.</w:t>
+        <w:t>++, avoiding the evaluation of collection size within loop conditions, and avoiding function calls inside for loop declarations. These anti-patterns waste redundant CPU cycles and energy during repeated executions.</w:t>
       </w:r>
     </w:p>
     <w:p>
@@ -5465,7 +5481,10 @@
         <w:jc w:val="both"/>
       </w:pPr>
       <w:r>
-        <w:t>Here is a detailed breakdown of the technical fixes applied:</w:t>
+        <w:br/>
+      </w:r>
+      <w:r>
+        <w:t>Here is a breakdown of the technical fixes applied:</w:t>
       </w:r>
     </w:p>
     <w:p>
@@ -5496,10 +5515,11 @@
         <w:rPr>
           <w:noProof/>
         </w:rPr>
+        <w:lastRenderedPageBreak/>
         <w:drawing>
-          <wp:inline distT="0" distB="0" distL="0" distR="0" wp14:anchorId="3BC8CB0F" wp14:editId="56BCC50D">
-            <wp:extent cx="4669971" cy="1349828"/>
-            <wp:effectExtent l="0" t="0" r="0" b="3175"/>
+          <wp:inline distT="0" distB="0" distL="0" distR="0" wp14:anchorId="3BC8CB0F" wp14:editId="542490AD">
+            <wp:extent cx="4320540" cy="1600200"/>
+            <wp:effectExtent l="0" t="0" r="3810" b="0"/>
             <wp:docPr id="16" name="image7.png"/>
             <wp:cNvGraphicFramePr/>
             <a:graphic xmlns:a="http://schemas.openxmlformats.org/drawingml/2006/main">
@@ -5519,7 +5539,7 @@
                   <pic:spPr>
                     <a:xfrm>
                       <a:off x="0" y="0"/>
-                      <a:ext cx="4885481" cy="1412120"/>
+                      <a:ext cx="4521582" cy="1674660"/>
                     </a:xfrm>
                     <a:prstGeom prst="rect">
                       <a:avLst/>
@@ -5532,6 +5552,12 @@
           </wp:inline>
         </w:drawing>
       </w:r>
+    </w:p>
+    <w:p>
+      <w:pPr>
+        <w:ind w:left="720"/>
+        <w:jc w:val="both"/>
+      </w:pPr>
     </w:p>
     <w:p>
       <w:pPr>
@@ -5600,6 +5626,12 @@
     </w:p>
     <w:p>
       <w:pPr>
+        <w:ind w:left="720"/>
+        <w:jc w:val="both"/>
+      </w:pPr>
+    </w:p>
+    <w:p>
+      <w:pPr>
         <w:numPr>
           <w:ilvl w:val="0"/>
           <w:numId w:val="18"/>
@@ -5627,6 +5659,12 @@
     </w:p>
     <w:p>
       <w:pPr>
+        <w:ind w:left="720"/>
+        <w:jc w:val="both"/>
+      </w:pPr>
+    </w:p>
+    <w:p>
+      <w:pPr>
         <w:numPr>
           <w:ilvl w:val="0"/>
           <w:numId w:val="18"/>
@@ -5653,7 +5691,6 @@
         <w:rPr>
           <w:noProof/>
         </w:rPr>
-        <w:lastRenderedPageBreak/>
         <w:drawing>
           <wp:inline distT="0" distB="0" distL="0" distR="0" wp14:anchorId="0BEA8AEC" wp14:editId="56A1C1F9">
             <wp:extent cx="4517571" cy="1992085"/>
@@ -5774,11 +5811,6 @@
       <w:r>
         <w:t xml:space="preserve"> </w:t>
       </w:r>
-    </w:p>
-    <w:p>
-      <w:pPr>
-        <w:jc w:val="both"/>
-      </w:pPr>
     </w:p>
     <w:p>
       <w:pPr>
@@ -6414,6 +6446,7 @@
         </w:rPr>
       </w:pPr>
       <w:r>
+        <w:lastRenderedPageBreak/>
         <w:t>6</w:t>
       </w:r>
       <w:r>
@@ -6557,66 +6590,66 @@
         <w:pStyle w:val="Heading1"/>
       </w:pPr>
       <w:r>
+        <w:t>7</w:t>
+      </w:r>
+      <w:r>
+        <w:t>.</w:t>
+      </w:r>
+      <w:r>
+        <w:t xml:space="preserve"> Security Analysis with </w:t>
+      </w:r>
+      <w:proofErr w:type="spellStart"/>
+      <w:r>
+        <w:t>GitGuardian</w:t>
+      </w:r>
+      <w:proofErr w:type="spellEnd"/>
+      <w:r>
+        <w:t xml:space="preserve">, </w:t>
+      </w:r>
+      <w:proofErr w:type="spellStart"/>
+      <w:r>
+        <w:t>Snyk</w:t>
+      </w:r>
+      <w:proofErr w:type="spellEnd"/>
+      <w:r>
+        <w:t xml:space="preserve"> and </w:t>
+      </w:r>
+      <w:proofErr w:type="spellStart"/>
+      <w:r>
+        <w:t>Sonarqube</w:t>
+      </w:r>
+      <w:proofErr w:type="spellEnd"/>
+    </w:p>
+    <w:p>
+      <w:pPr>
+        <w:jc w:val="both"/>
+      </w:pPr>
+      <w:r>
+        <w:t xml:space="preserve">To enhance system quality from a security standpoint, a multi-layered analysis strategy was adopted utilizing complementary tools: SonarQube for static code analysis and vulnerability detection, </w:t>
+      </w:r>
+      <w:proofErr w:type="spellStart"/>
+      <w:r>
+        <w:t>GitGuardian</w:t>
+      </w:r>
+      <w:proofErr w:type="spellEnd"/>
+      <w:r>
+        <w:t xml:space="preserve"> to identify secrets, tokens, or credentials accidentally exposed in the repository, and </w:t>
+      </w:r>
+      <w:proofErr w:type="spellStart"/>
+      <w:r>
+        <w:t>Snyk</w:t>
+      </w:r>
+      <w:proofErr w:type="spellEnd"/>
+      <w:r>
+        <w:t xml:space="preserve"> for deep code-level security analysis to detect vulnerable patterns.</w:t>
+      </w:r>
+    </w:p>
+    <w:p>
+      <w:pPr>
+        <w:jc w:val="both"/>
+      </w:pPr>
+      <w:r>
         <w:lastRenderedPageBreak/>
-        <w:t>7</w:t>
-      </w:r>
-      <w:r>
-        <w:t>.</w:t>
-      </w:r>
-      <w:r>
-        <w:t xml:space="preserve"> Security Analysis with </w:t>
-      </w:r>
-      <w:proofErr w:type="spellStart"/>
-      <w:r>
-        <w:t>GitGuardian</w:t>
-      </w:r>
-      <w:proofErr w:type="spellEnd"/>
-      <w:r>
-        <w:t xml:space="preserve">, </w:t>
-      </w:r>
-      <w:proofErr w:type="spellStart"/>
-      <w:r>
-        <w:t>Snyk</w:t>
-      </w:r>
-      <w:proofErr w:type="spellEnd"/>
-      <w:r>
-        <w:t xml:space="preserve"> and </w:t>
-      </w:r>
-      <w:proofErr w:type="spellStart"/>
-      <w:r>
-        <w:t>Sonarqube</w:t>
-      </w:r>
-      <w:proofErr w:type="spellEnd"/>
-    </w:p>
-    <w:p>
-      <w:pPr>
-        <w:jc w:val="both"/>
-      </w:pPr>
-      <w:r>
-        <w:t xml:space="preserve">To enhance system quality from a security standpoint, a multi-layered analysis strategy was adopted utilizing complementary tools: SonarQube for static code analysis and vulnerability detection, </w:t>
-      </w:r>
-      <w:proofErr w:type="spellStart"/>
-      <w:r>
-        <w:t>GitGuardian</w:t>
-      </w:r>
-      <w:proofErr w:type="spellEnd"/>
-      <w:r>
-        <w:t xml:space="preserve"> to identify secrets, tokens, or credentials accidentally exposed in the repository, and </w:t>
-      </w:r>
-      <w:proofErr w:type="spellStart"/>
-      <w:r>
-        <w:t>Snyk</w:t>
-      </w:r>
-      <w:proofErr w:type="spellEnd"/>
-      <w:r>
-        <w:t xml:space="preserve"> for deep code-level security analysis to detect vulnerable patterns.</w:t>
-      </w:r>
-    </w:p>
-    <w:p>
-      <w:pPr>
-        <w:jc w:val="both"/>
-      </w:pPr>
-      <w:r>
         <w:t>The objective for this phase was defined in an explicit and measurable way: to achieve zero security vulnerabilities across all adopted tools. The following sections describe the detected issues, their potential impact, and the corrective actions applied to reach this target.</w:t>
       </w:r>
     </w:p>
@@ -6842,42 +6875,42 @@
           <w:b/>
           <w:bCs/>
         </w:rPr>
+        <w:t>Applied Fixes</w:t>
+      </w:r>
+    </w:p>
+    <w:p>
+      <w:pPr>
+        <w:jc w:val="both"/>
+        <w:rPr>
+          <w:noProof/>
+        </w:rPr>
+      </w:pPr>
+      <w:r>
+        <w:t xml:space="preserve">To resolve this issue, all forward calls were encapsulated within try/catch blocks to intercept </w:t>
+      </w:r>
+      <w:proofErr w:type="spellStart"/>
+      <w:r>
+        <w:t>ServletException</w:t>
+      </w:r>
+      <w:proofErr w:type="spellEnd"/>
+      <w:r>
+        <w:t xml:space="preserve"> and </w:t>
+      </w:r>
+      <w:proofErr w:type="spellStart"/>
+      <w:r>
+        <w:t>IOException</w:t>
+      </w:r>
+      <w:proofErr w:type="spellEnd"/>
+      <w:r>
+        <w:t>, enabling the system to handle errors in a controlled and secure manner. After applying these fixes, SonarQube was re-run and the target was successfully reached, with the dashboard reporting zero security vulnerabilities.</w:t>
+      </w:r>
+    </w:p>
+    <w:p>
+      <w:r>
+        <w:rPr>
+          <w:noProof/>
+        </w:rPr>
         <w:lastRenderedPageBreak/>
-        <w:t>Applied Fixes</w:t>
-      </w:r>
-    </w:p>
-    <w:p>
-      <w:pPr>
-        <w:jc w:val="both"/>
-        <w:rPr>
-          <w:noProof/>
-        </w:rPr>
-      </w:pPr>
-      <w:r>
-        <w:t xml:space="preserve">To resolve this issue, all forward calls were encapsulated within try/catch blocks to intercept </w:t>
-      </w:r>
-      <w:proofErr w:type="spellStart"/>
-      <w:r>
-        <w:t>ServletException</w:t>
-      </w:r>
-      <w:proofErr w:type="spellEnd"/>
-      <w:r>
-        <w:t xml:space="preserve"> and </w:t>
-      </w:r>
-      <w:proofErr w:type="spellStart"/>
-      <w:r>
-        <w:t>IOException</w:t>
-      </w:r>
-      <w:proofErr w:type="spellEnd"/>
-      <w:r>
-        <w:t>, enabling the system to handle errors in a controlled and secure manner. After applying these fixes, SonarQube was re-run and the target was successfully reached, with the dashboard reporting zero security vulnerabilities.</w:t>
-      </w:r>
-    </w:p>
-    <w:p>
-      <w:r>
-        <w:rPr>
-          <w:noProof/>
-        </w:rPr>
         <w:drawing>
           <wp:inline distT="0" distB="0" distL="0" distR="0" wp14:anchorId="748326FA" wp14:editId="667B3A28">
             <wp:extent cx="3630673" cy="2209800"/>
@@ -7051,7 +7084,7 @@
           <w:noProof/>
         </w:rPr>
         <w:drawing>
-          <wp:inline distT="0" distB="0" distL="0" distR="0" wp14:anchorId="54557B63" wp14:editId="694388DE">
+          <wp:inline distT="0" distB="0" distL="0" distR="0" wp14:anchorId="54557B63" wp14:editId="353441F9">
             <wp:extent cx="5727700" cy="1625600"/>
             <wp:effectExtent l="0" t="0" r="6350" b="0"/>
             <wp:docPr id="915741800" name="Picture 7"/>
@@ -7150,7 +7183,6 @@
         <w:rPr>
           <w:noProof/>
         </w:rPr>
-        <w:lastRenderedPageBreak/>
         <w:drawing>
           <wp:inline distT="0" distB="0" distL="0" distR="0" wp14:anchorId="2005CC97" wp14:editId="7294B422">
             <wp:extent cx="4508500" cy="381000"/>
@@ -7277,7 +7309,11 @@
       </w:r>
       <w:proofErr w:type="gramEnd"/>
       <w:r>
-        <w:t xml:space="preserve">Set DB_PASSWORD </w:t>
+        <w:t xml:space="preserve">Set </w:t>
+      </w:r>
+      <w:r>
+        <w:lastRenderedPageBreak/>
+        <w:t xml:space="preserve">DB_PASSWORD </w:t>
       </w:r>
       <w:proofErr w:type="gramStart"/>
       <w:r>
@@ -7404,13 +7440,11 @@
       </w:r>
     </w:p>
     <w:p/>
-    <w:p/>
     <w:p>
       <w:pPr>
         <w:pStyle w:val="Heading2"/>
       </w:pPr>
       <w:r>
-        <w:lastRenderedPageBreak/>
         <w:t>7.4 Final Results</w:t>
       </w:r>
     </w:p>
@@ -7482,12 +7516,12 @@
         <w:t xml:space="preserve"> The single identified hardcoded password issue was manually verified as a false positive.</w:t>
       </w:r>
     </w:p>
-    <w:p/>
     <w:p>
       <w:pPr>
         <w:pStyle w:val="Heading1"/>
       </w:pPr>
       <w:r>
+        <w:lastRenderedPageBreak/>
         <w:t>8. Final Considerations</w:t>
       </w:r>
     </w:p>
@@ -7571,7 +7605,7 @@
 </file>
 
 <file path=word/numbering.xml><?xml version="1.0" encoding="utf-8"?>
-<w:numbering xmlns:wpc="http://schemas.microsoft.com/office/word/2010/wordprocessingCanvas" xmlns:cx="http://schemas.microsoft.com/office/drawing/2014/chartex" xmlns:cx1="http://schemas.microsoft.com/office/drawing/2015/9/8/chartex" xmlns:cx2="http://schemas.microsoft.com/office/drawing/2015/10/21/chartex" xmlns:cx3="http://schemas.microsoft.com/office/drawing/2016/5/9/chartex" xmlns:cx4="http://schemas.microsoft.com/office/drawing/2016/5/10/chartex" xmlns:cx5="http://schemas.microsoft.com/office/drawing/2016/5/11/chartex" xmlns:cx6="http://schemas.microsoft.com/office/drawing/2016/5/12/chartex" xmlns:cx7="http://schemas.microsoft.com/office/drawing/2016/5/13/chartex" xmlns:cx8="http://schemas.microsoft.com/office/drawing/2016/5/14/chartex" xmlns:mc="http://schemas.openxmlformats.org/markup-compatibility/2006" xmlns:aink="http://schemas.microsoft.com/office/drawing/2016/ink" xmlns:am3d="http://schemas.microsoft.com/office/drawing/2017/model3d" xmlns:o="urn:schemas-microsoft-com:office:office" xmlns:oel="http://schemas.microsoft.com/office/2019/extlst" xmlns:r="http://schemas.openxmlformats.org/officeDocument/2006/relationships" xmlns:m="http://schemas.openxmlformats.org/officeDocument/2006/math" xmlns:v="urn:schemas-microsoft-com:vml" xmlns:wp14="http://schemas.microsoft.com/office/word/2010/wordprocessingDrawing" xmlns:wp="http://schemas.openxmlformats.org/drawingml/2006/wordprocessingDrawing" xmlns:w10="urn:schemas-microsoft-com:office:word" xmlns:w="http://schemas.openxmlformats.org/wordprocessingml/2006/main" xmlns:w14="http://schemas.microsoft.com/office/word/2010/wordml" xmlns:w15="http://schemas.microsoft.com/office/word/2012/wordml" xmlns:w16cex="http://schemas.microsoft.com/office/word/2018/wordml/cex" xmlns:w16cid="http://schemas.microsoft.com/office/word/2016/wordml/cid" xmlns:w16="http://schemas.microsoft.com/office/word/2018/wordml" xmlns:w16du="http://schemas.microsoft.com/office/word/2023/wordml/word16du" xmlns:w16sdtdh="http://schemas.microsoft.com/office/word/2020/wordml/sdtdatahash" xmlns:w16sdtfl="http://schemas.microsoft.com/office/word/2024/wordml/sdtformatlock" xmlns:w16se="http://schemas.microsoft.com/office/word/2015/wordml/symex" xmlns:wpg="http://schemas.microsoft.com/office/word/2010/wordprocessingGroup" xmlns:wpi="http://schemas.microsoft.com/office/word/2010/wordprocessingInk" xmlns:wne="http://schemas.microsoft.com/office/word/2006/wordml" xmlns:wps="http://schemas.microsoft.com/office/word/2010/wordprocessingShape" mc:Ignorable="w14 w15 w16se w16cid w16 w16cex w16sdtdh w16sdtfl w16du wp14">
+<w:numbering xmlns:wpc="http://schemas.microsoft.com/office/word/2010/wordprocessingCanvas" xmlns:cx="http://schemas.microsoft.com/office/drawing/2014/chartex" xmlns:cx1="http://schemas.microsoft.com/office/drawing/2015/9/8/chartex" xmlns:cx2="http://schemas.microsoft.com/office/drawing/2015/10/21/chartex" xmlns:cx3="http://schemas.microsoft.com/office/drawing/2016/5/9/chartex" xmlns:cx4="http://schemas.microsoft.com/office/drawing/2016/5/10/chartex" xmlns:cx5="http://schemas.microsoft.com/office/drawing/2016/5/11/chartex" xmlns:cx6="http://schemas.microsoft.com/office/drawing/2016/5/12/chartex" xmlns:cx7="http://schemas.microsoft.com/office/drawing/2016/5/13/chartex" xmlns:cx8="http://schemas.microsoft.com/office/drawing/2016/5/14/chartex" xmlns:mc="http://schemas.openxmlformats.org/markup-compatibility/2006" xmlns:aink="http://schemas.microsoft.com/office/drawing/2016/ink" xmlns:am3d="http://schemas.microsoft.com/office/drawing/2017/model3d" xmlns:o="urn:schemas-microsoft-com:office:office" xmlns:oel="http://schemas.microsoft.com/office/2019/extlst" xmlns:r="http://schemas.openxmlformats.org/officeDocument/2006/relationships" xmlns:m="http://schemas.openxmlformats.org/officeDocument/2006/math" xmlns:v="urn:schemas-microsoft-com:vml" xmlns:wp14="http://schemas.microsoft.com/office/word/2010/wordprocessingDrawing" xmlns:wp="http://schemas.openxmlformats.org/drawingml/2006/wordprocessingDrawing" xmlns:w10="urn:schemas-microsoft-com:office:word" xmlns:w="http://schemas.openxmlformats.org/wordprocessingml/2006/main" xmlns:w14="http://schemas.microsoft.com/office/word/2010/wordml" xmlns:w15="http://schemas.microsoft.com/office/word/2012/wordml" xmlns:w16cei="http://schemas.microsoft.com/office/word/2026/wordml/cei" xmlns:w16cex="http://schemas.microsoft.com/office/word/2018/wordml/cex" xmlns:w16cid="http://schemas.microsoft.com/office/word/2016/wordml/cid" xmlns:w16="http://schemas.microsoft.com/office/word/2018/wordml" xmlns:w16du="http://schemas.microsoft.com/office/word/2023/wordml/word16du" xmlns:w16sdtdh="http://schemas.microsoft.com/office/word/2020/wordml/sdtdatahash" xmlns:w16sdtfl="http://schemas.microsoft.com/office/word/2024/wordml/sdtformatlock" xmlns:w16se="http://schemas.microsoft.com/office/word/2015/wordml/symex" xmlns:wpg="http://schemas.microsoft.com/office/word/2010/wordprocessingGroup" xmlns:wpi="http://schemas.microsoft.com/office/word/2010/wordprocessingInk" xmlns:wne="http://schemas.microsoft.com/office/word/2006/wordml" xmlns:wps="http://schemas.microsoft.com/office/word/2010/wordprocessingShape" mc:Ignorable="w14 w15 w16se w16cid w16 w16cex w16sdtdh w16sdtfl w16du wp14">
   <w:abstractNum w:abstractNumId="0" w15:restartNumberingAfterBreak="0">
     <w:nsid w:val="07A62DBF"/>
     <w:multiLevelType w:val="multilevel"/>

</xml_diff>